<commit_message>
Sync current project documents
</commit_message>
<xml_diff>
--- a/docs/低资源条件下句法与构式知识辅助的上海话变调域预测研究.docx
+++ b/docs/低资源条件下句法与构式知识辅助的上海话变调域预测研究.docx
@@ -7,12 +7,12 @@
         <w:pStyle w:val="a3"/>
       </w:pPr>
       <w:r>
-        <w:t>低资源条件下句法与构式知识辅助的上海话变调域预测研究</w:t>
-      </w:r>
-    </w:p>
-    <w:p>
-      <w:r>
-        <w:t>首次进入项目的读者请先读[本科生导读与术语例解](07_本科生导读与术语例解.md)，再用本文掌握正式研究范围与执行口径。</w:t>
+        <w:t>低资源条件下上海话变调界限预测研究</w:t>
+      </w:r>
+    </w:p>
+    <w:p>
+      <w:r>
+        <w:t>首次进入项目的读者请先读[本科生导读与术语例解](07_本科生导读与术语例解.md)。本文件规定2026年9月9日以后执行的研究范围；01至03号文档仅保留为前版记录。</w:t>
       </w:r>
     </w:p>
     <w:p>
@@ -25,17 +25,17 @@
     </w:p>
     <w:p>
       <w:r>
-        <w:t>本课题研究在低资源条件下，哪些词法、句法、构式及语境信息能帮助预测上海话自然口语的变调域，并检验这些知识能否推广到陌生词项和句子。研究以中青年市区上海话使用者为主，年长者作对照；团队由5名语言学本科生和2名计算机本科生组成，周期三个月。</w:t>
-      </w:r>
-    </w:p>
-    <w:p>
-      <w:r>
-        <w:t>变调域与语法结构的对应关系是待验证假说。句法可以约束成组，词汇化、音步、语速与焦点也可能改变读法。仅标变调界限可能不足以描述整句语音，还需要区分较强韵律分组、实际停顿、音高事件与句末语调。我们以Selkirk与Shen、端木、Roberts的不同主张建立可比较的实验，不将其中任何一套理论直接当作标注答案。</w:t>
-      </w:r>
-    </w:p>
-    <w:p>
-      <w:r>
-        <w:t>本课题保留四个研究问题：哪些结构知识值得标；人工知识能否凝练成可推广规则；哪些变化必须依赖语境与说话方式；人工与AI分批协作能否在相同时间内增加独立质检合格的标注。给定正确读音及韵律输入后现有TTS能够读好，作为本课题前端研究的工作前提。</w:t>
+        <w:t>本课题现在只研究一个核心任务：给定上海话文本、词典读音以及可在合成前获得的结构信息，预测每两个相邻音节之间是否存在低层变调域界限。本文把这一低层单位记作AP；项目主要输出是AP边界序列，而不是焦点、停顿、中间短语、语调短语或连续音高曲线。</w:t>
+      </w:r>
+    </w:p>
+    <w:p>
+      <w:r>
+        <w:t>研究以中青年市区上海话使用者为主，年长者只在资源允许时作为探索对照。低资源条件下，重点比较词界、词性与构词、局部句法和全句结构能否提高陌生句族上的边界预测。句法与变调域的对应关系仍是待验证假说，词汇化、音节数和语速也可能改变分域。</w:t>
+      </w:r>
+    </w:p>
+    <w:p>
+      <w:r>
+        <w:t>焦点、停顿、ip、IP、句末H%或L%和连续F0生成暂不研究，不进入核心标签、模型输入、评价指标或理论成败判据。核心材料使用无刻意纠正和对比的中性语境；自然语料中明显依赖焦点或含不流利停顿的句子进入`excluded_or_future`清单，不强行标成普通边界样本。</w:t>
       </w:r>
     </w:p>
     <w:p>
@@ -43,57 +43,37 @@
         <w:pStyle w:val="1"/>
       </w:pPr>
       <w:r>
-        <w:t>优先构式及具体例子</w:t>
-      </w:r>
-    </w:p>
-    <w:p>
-      <w:r>
-        <w:t>以下均为待母语者审阅的候选。竖线只标关注位置，不给出预定读法。学习文档提供术语、原图出处和逐步推导。</w:t>
-      </w:r>
-    </w:p>
-    <w:p>
-      <w:r>
-        <w:t>C01条件／因果复句：“假使伊来｜小李就要走”。固定字串比较舒适和较快语速，检验“来”后是否形成较强分组。因果扩展“因为伊来了｜小李就走了”另审措辞与长度，不能与条件句直接混为最小对。</w:t>
-      </w:r>
-    </w:p>
-    <w:p>
-      <w:r>
-        <w:t>C02关系小句：“[我老欢喜个]人｜来上海”，释义为“我很喜欢的那个人来上海”。检查关系小句内部、个前后和名词中心语后边界；不能见“个”就分域。原图转写用“的”，统一正字另记录。</w:t>
-      </w:r>
-    </w:p>
-    <w:p>
-      <w:r>
-        <w:t>C03否定谓语与复杂宾语：“阿爸勿欢喜｜姆妈个礼物”。同一句分别回答态度问题与纠正“阿爸喜欢礼物”的判断，比较后焦点变化是否越过宾语NP左边缘。</w:t>
-      </w:r>
-    </w:p>
-    <w:p>
-      <w:r>
-        <w:t>C04话题与宾语：“我看过搿本书”与“搿本书｜我看过”。观察话题后的分组，再以相同话题句配不同语境检验纠正的作用。语序与长度等差别应单独控制。</w:t>
-      </w:r>
-    </w:p>
-    <w:p>
-      <w:r>
-        <w:t>C05句末语气：“伊来过上海”“伊来过上海伐”“伊阿是来过上海”。检验助词问句和正反问是否具有相同句末音高事件。不能用一个问号代替句式和语境。</w:t>
-      </w:r>
-    </w:p>
-    <w:p>
-      <w:r>
-        <w:t>C06词内对比：“伊礼拜｜三来上海”。同字串回答日期问题或纠正“礼拜四”；检验“三”是否成为新域首，还是整个“礼拜三”一起突出。</w:t>
-      </w:r>
-    </w:p>
-    <w:p>
-      <w:r>
-        <w:t>C07虚词与嵌入：“伊讲｜我明朝来”，以及论文“就是｜我根本无没辰光”一类字串。检查虚词／代词是否跨较高句法边缘附着，区分合域与音高弱化。</w:t>
-      </w:r>
-    </w:p>
-    <w:p>
-      <w:r>
-        <w:t>C08结果补语与后果小句：“伊推｜开门”与“伊推门｜门开了”，再补“伊推勿开门”。重点比较局部动补、潜能与小句边界；正式材料需匹配长度、词项与语境。</w:t>
-      </w:r>
-    </w:p>
-    <w:p>
-      <w:r>
-        <w:t>前三个月以C01、C03、C05、C06四项受控实验为核心；其余在自然语料中登记并试录。选择这四项是因为它们能直接形成不同理论的可检验对照，不代表其他构式不重要。</w:t>
+        <w:t>研究问题</w:t>
+      </w:r>
+    </w:p>
+    <w:p>
+      <w:r>
+        <w:t>1. 仅凭汉字或音节序列，低层变调界限能预测到什么程度？</w:t>
+      </w:r>
+    </w:p>
+    <w:p>
+      <w:r>
+        <w:t>2. 词界、词性、虚实词、构词和词汇化信息分别提供多少增量？</w:t>
+      </w:r>
+    </w:p>
+    <w:p>
+      <w:r>
+        <w:t>3. 动宾、动补、数量、修饰、嵌入等局部或全句结构能否改善未见句族预测？</w:t>
+      </w:r>
+    </w:p>
+    <w:p>
+      <w:r>
+        <w:t>4. 人工总结的边界规则能否在新词项、新句族和新说话人上迁移，并与小型神经模型互补？</w:t>
+      </w:r>
+    </w:p>
+    <w:p>
+      <w:r>
+        <w:t>5. 在固定人工时间内，AI预标能否增加经独立质检合格的AP边界标注？</w:t>
+      </w:r>
+    </w:p>
+    <w:p>
+      <w:r>
+        <w:t>当前不回答“焦点落在哪里”“哪里应该停顿”“是否存在ip或IP”“句末该升还是降”和“怎样生成完整F0曲线”。这些问题不再占用三个月周期的采集、标注和建模预算。</w:t>
       </w:r>
     </w:p>
     <w:p>
@@ -101,67 +81,22 @@
         <w:pStyle w:val="1"/>
       </w:pPr>
       <w:r>
-        <w:t>方法一 录音与分层标注</w:t>
-      </w:r>
-    </w:p>
-    <w:p>
-      <w:r>
-        <w:t>收集至少60分钟有效自然口语，保留上下文，不只截一句。有效时长指质量可用、能确定参与者及来源的会话片段，另报每人的净说话时长和重叠语音；不把两名说话人的同时发音重复加总。建议覆盖多位中青年和多个独立会话，年长者作探索对照。</w:t>
-      </w:r>
-    </w:p>
-    <w:p>
-      <w:r>
-        <w:t>九层信息如下，以“假使伊来，小李就要走”说明。所有样例时间和音高是假数，仅用于教学，不进数据集。</w:t>
-      </w:r>
-    </w:p>
-    <w:p>
-      <w:r>
-        <w:t>A音频：utterance_id=U_DEMO_001，speaker_id=S_DEMO，source=demonstration，audio=null，split=excluded。正式数据填写真实音频、来源和匿名说话人信息。</w:t>
-      </w:r>
-    </w:p>
-    <w:p>
-      <w:r>
-        <w:t>B音节及读音：假0.00至0.25秒、使0.25至0.50秒、伊0.50至0.75秒、来0.75至1.10秒，依次到走2.05至2.40秒；每音节附IPA与传统调号，未知写UNK，不猜读音。</w:t>
-      </w:r>
-    </w:p>
-    <w:p>
-      <w:r>
-        <w:t>C词法：假使／伊／来／小李／就／要／走，附连接词、代词、动词、专名等词性和构词标记。</w:t>
-      </w:r>
-    </w:p>
-    <w:p>
-      <w:r>
-        <w:t>D局部句法：NP(伊)、VP(来)、NP(小李)、VP(就 要 走)，标要与走的情态补足关系。</w:t>
-      </w:r>
-    </w:p>
-    <w:p>
-      <w:r>
-        <w:t>E全句句法：S(COND(假使,伊来),MAIN(小李就要走))，记录条件范围和主句范围。程序用统一的音节半开区间保存，不混用字数和词数。</w:t>
-      </w:r>
-    </w:p>
-    <w:p>
-      <w:r>
-        <w:t>F变调域／AP：假设“(假使)(伊)(来)(小李)(就要)(走)”。注意“就／要”词层分开，AP层可合；这是示意读法，不是理论答案。</w:t>
-      </w:r>
-    </w:p>
-    <w:p>
-      <w:r>
-        <w:t>G音高事件及测量：示意“假使”首L*、后+H；句末%。另表记录来时长0.35秒、边界静音0秒、前后F0等，均为假数。真实音高目标须听辨与频谱核验。</w:t>
-      </w:r>
-    </w:p>
-    <w:p>
-      <w:r>
-        <w:t>Hip、IP及Break：假设“[假使伊来]ip [小李就要走]ip”，整句一个IP；“来”后可标3而静音为0。另一个读法可同处标2，句法树不因此改变。</w:t>
-      </w:r>
-    </w:p>
-    <w:p>
-      <w:r>
-        <w:t>I语境：记录提示“讲讲伊来以后会发生啥事体”、预期广焦点、实际突出未知、舒适语速。预期焦点与实际实现分开，不能拿提示代替录音事实。</w:t>
-      </w:r>
-    </w:p>
-    <w:p>
-      <w:r>
-        <w:t>Praat通常放六条轨道：syllable、word、AP、tones、breaks、misc；结构、语境和元数据放对齐JSON。先自动生成粗音节／F0候选，人工修正，再批量导出时长、有效F0、每音节20点和静音。F0缺失记NA，不记0；喉塞闭塞不直接当停顿；最高音不直接标焦点；词汇化和语法身份独立判断。学生学习文档逐条给出反例和完整九层样例。</w:t>
+        <w:t>任务定义</w:t>
+      </w:r>
+    </w:p>
+    <w:p>
+      <w:r>
+        <w:t>一句话有n个音节，就有n减1个相邻位置。对每个位置预测`0=同一AP内部`或`1=AP结束`。例如九音节教学句“假使伊来小李就要走”共有八个候选位置；某个示意分域`(假使)(伊)(来)(小李)(就要)(走)`可转成边界序列`0 1 1 1 0 1 0 1`。该序列只是格式示范，不是这句话的正式读法。</w:t>
+      </w:r>
+    </w:p>
+    <w:p>
+      <w:r>
+        <w:t>主任务是二分类AP边界。模型可以额外输出每个位置的边界概率和前k个合法整句候选，但不得把词界直接复制为答案。若一条录音有两种都可接受的低层分域，应保留候选集合或分布；主评测同时报告严格单一gold和多参考候选覆盖。</w:t>
+      </w:r>
+    </w:p>
+    <w:p>
+      <w:r>
+        <w:t>本项目的“变调界限”不等于书写标点、真实静音或所有韵律层级。标注者判断的是低层连读变调组织是否在该音节后结束。停顿只用于发现录音不流利或切分问题，不作为待预测标签。</w:t>
       </w:r>
     </w:p>
     <w:p>
@@ -169,32 +104,121 @@
         <w:pStyle w:val="1"/>
       </w:pPr>
       <w:r>
-        <w:t>方法二 受控检验三套理论</w:t>
-      </w:r>
-    </w:p>
-    <w:p>
-      <w:r>
-        <w:t>S&amp;S检验：以“阿爸勿欢喜姆妈个礼物”固定字串、改变广焦点／普通窄焦点／纠正焦点，冻结宾语NP结构后检查后焦点作用是否跨过“姆妈”的NP左边缘。若宾语仍保留词汇目标并在该边缘恢复，支持此处的范围预测；若纠正条件稳定越过NP去重音，挑战该强规则；如果只是整体降低而目标保留，不能称音系删调反证。</w:t>
-      </w:r>
-    </w:p>
-    <w:p>
-      <w:r>
-        <w:t>端木检验：以“伊礼拜三来上海”改变焦点语境，比较“(礼拜三)”与“(礼拜)(三)”。若独立确认的非首语素突出伴随新AP及域首调实现，支持重音驱动重组；若只全词调域扩大，则焦点不必拆域，需要限定词汇化或语素条件。另对同一长单位控制语速，区分真正合域与仅缩短时长。</w:t>
-      </w:r>
-    </w:p>
-    <w:p>
-      <w:r>
-        <w:t>Roberts检验：以“假使伊来，小李就要走”检查有无静音之外，是否还存在听感较强、延长、重置共同支持的ip；以三类问句检查词汇调之外的H%、L%、%及目标互动。若不同功能稳定要求不同末端事件，支持分层表示；若边界表现连续渐变，需考虑有序或连续模型而非强制离散ip。其焦点类型主张与S&amp;S共享同一批对照数据。</w:t>
-      </w:r>
-    </w:p>
-    <w:p>
-      <w:r>
-        <w:t>小试采用4项各1个开发句族、每族3条件、2遍、4名中青年，共96条。通过自然度与标注一致性检查后，扩至每项6个全新句族；以12名中青年为预算则为1728条，年长4人为576条探索对照。人数尚待资源确认，不是已招募或经功效计算确定的规模。未显著不等于无效，报告说话人和句族层面的效应量、区间与个体差异。</w:t>
-      </w:r>
-    </w:p>
-    <w:p>
-      <w:r>
-        <w:t>完整S&amp;S、D、R验证卡见配套学习文档第二部分，包括每项假设、操作、可能结果、替代解释与理论延伸。</w:t>
+        <w:t>优先结构与候选例子</w:t>
+      </w:r>
+    </w:p>
+    <w:p>
+      <w:r>
+        <w:t>所有句子均需母语者审阅。括号只表示待检验的AP候选，不预定正式读法。</w:t>
+      </w:r>
+    </w:p>
+    <w:p>
+      <w:pPr>
+        <w:pStyle w:val="2"/>
+      </w:pPr>
+      <w:r>
+        <w:t>C01 实词与虚词附着</w:t>
+      </w:r>
+    </w:p>
+    <w:p>
+      <w:r>
+        <w:t>候选“老师买仔书”“阿姐看仔报纸”。检查体貌成分是否并入前一动词域、后续实词是否另起域。比较`(老师)(买仔)(书)`等规则候选，重点检验实词左边缘和虚词附着的预测价值。</w:t>
+      </w:r>
+    </w:p>
+    <w:p>
+      <w:pPr>
+        <w:pStyle w:val="2"/>
+      </w:pPr>
+      <w:r>
+        <w:t>C02 普通动宾与词汇化动宾</w:t>
+      </w:r>
+    </w:p>
+    <w:p>
+      <w:r>
+        <w:t>比较生产性动宾和已经词汇化的动宾式组合，例如旧jieba标签中的`vn`只作为候选来源。检验表面相同的V加N结构是否因词汇化程度形成不同界限。旧标签必须由当前标注者重新审阅。</w:t>
+      </w:r>
+    </w:p>
+    <w:p>
+      <w:pPr>
+        <w:pStyle w:val="2"/>
+      </w:pPr>
+      <w:r>
+        <w:t>C03 动补与潜能结构</w:t>
+      </w:r>
+    </w:p>
+    <w:p>
+      <w:r>
+        <w:t>候选“伊推开门”“伊推勿开门”，另建多个自然句族。检查动词、结果补语、否定成分和宾语之间的AP边界。正式比较匹配音节数和词项，不使用停顿或焦点操纵。</w:t>
+      </w:r>
+    </w:p>
+    <w:p>
+      <w:pPr>
+        <w:pStyle w:val="2"/>
+      </w:pPr>
+      <w:r>
+        <w:t>C04 数量结构</w:t>
+      </w:r>
+    </w:p>
+    <w:p>
+      <w:r>
+        <w:t>比较确数、概数及普通数量短语，但只研究它们是否产生不同AP边界。语义释义用于确定结构，不把数量焦点作为实验变量。上海话材料须独立核验，不能直接复制绍兴话或普通话读法。</w:t>
+      </w:r>
+    </w:p>
+    <w:p>
+      <w:pPr>
+        <w:pStyle w:val="2"/>
+      </w:pPr>
+      <w:r>
+        <w:t>C05 复合词与长词</w:t>
+      </w:r>
+    </w:p>
+    <w:p>
+      <w:r>
+        <w:t>比较二至五音节复合词、专名和生产性组合，记录词汇化程度与实际语速。检验固定一词一域、按长度分足等候选规则。较快或较慢条件可以保留，因为语速可能改变低层分域；不记录高层停顿类型。</w:t>
+      </w:r>
+    </w:p>
+    <w:p>
+      <w:pPr>
+        <w:pStyle w:val="2"/>
+      </w:pPr>
+      <w:r>
+        <w:t>C06 修饰与关系结构</w:t>
+      </w:r>
+    </w:p>
+    <w:p>
+      <w:r>
+        <w:t>候选“我老欢喜个人来上海”等仅作材料起点。重点检查修饰成分、结构助词、名词中心语和后续谓词附近的低层边界。关系小句结构可以作为模型输入，但不研究小句边缘是否形成ip。</w:t>
+      </w:r>
+    </w:p>
+    <w:p>
+      <w:pPr>
+        <w:pStyle w:val="2"/>
+      </w:pPr>
+      <w:r>
+        <w:t>C07 主谓和嵌入边缘</w:t>
+      </w:r>
+    </w:p>
+    <w:p>
+      <w:r>
+        <w:t>比较简单主谓、宾语小句和嵌入结构中的实词／代词起点，检验全句结构相对局部词性是否提供额外边界信息。出现明显纠正、强对比或不流利停顿的录音不进入核心集。</w:t>
+      </w:r>
+    </w:p>
+    <w:p>
+      <w:pPr>
+        <w:pStyle w:val="2"/>
+      </w:pPr>
+      <w:r>
+        <w:t>C08 历史四五字分式迁移</w:t>
+      </w:r>
+    </w:p>
+    <w:p>
+      <w:r>
+        <w:t>从旧jieba文献笔记中的一二、二一、一四、二三、三二等分式抽取可自然成句的材料，检验历史描写能否迁移到当代陌生词项。广用式／窄用式是历史分式术语，不等于广焦点／窄焦点；本轮不设计焦点条件。</w:t>
+      </w:r>
+    </w:p>
+    <w:p>
+      <w:r>
+        <w:t>第一批优先C01、C02、C03、C05，各做若干独立句族；C04、C06至C08在自然度审阅通过后扩展。选择标准是能否形成不同AP边界预测，不再以焦点范围、停顿或句末语调为优先级依据。</w:t>
       </w:r>
     </w:p>
     <w:p>
@@ -202,32 +226,52 @@
         <w:pStyle w:val="1"/>
       </w:pPr>
       <w:r>
-        <w:t>方法三 标注价值与神经网络</w:t>
-      </w:r>
-    </w:p>
-    <w:p>
-      <w:r>
-        <w:t>保留L0纯文本、L1词界、L2词性与构词、L3局部句法和构式、L4全句结构五种输入条件。九层是数据记录模块，L0至L4是模型可见信息的消融条件，两者不能混为九级网络。</w:t>
-      </w:r>
-    </w:p>
-    <w:p>
-      <w:r>
-        <w:t>先训练一个小型边界模型：字／音节表示经双向LSTM，每个相邻位置拼接左右表示、词长、调类及结构特征，经分类头预测低层域和较高层边界。可用小型Transformer作后续比较，先不从零训练大型语言模型。H=3或4应同时是低层域边界，通过一致性检查保证层级合法。</w:t>
-      </w:r>
-    </w:p>
-    <w:p>
-      <w:r>
-        <w:t>建议起始设置为128维字符嵌入、每方向128维的一层BiLSTM、0.2 dropout、Adam学习率0.001、batch16，最多50轮、开发集连续5轮不提升则停止。固定3个种子比较；这些是起始配置，不是已调好的最优参数。主任务预测是否为AP边界，ip/IP和AM类别仅在有可靠标签的子集上加入辅助损失，不为缺标样本制造负例。</w:t>
-      </w:r>
-    </w:p>
-    <w:p>
-      <w:r>
-        <w:t>人工结构与自动结构分别测试；自动结构训练采用折外预测或冻结parser，记录误差传播。语境条件分为纯文本、可见前文、人工预先指定焦点与语速三个上限不同的系统。目标录音的F0、实际时长、音高事件不能输入文本前端。神经消融只能说明预测价值，不能单独证明音系机制。</w:t>
-      </w:r>
-    </w:p>
-    <w:p>
-      <w:r>
-        <w:t>主要指标为音节间AP边界F1、ip/IP边界F1、整句完全匹配、候选覆盖与不合理候选率。不要将自动识别时间偏差与文本边界位置准确率混在一起。F0生成作为后续辅助验证，沿用现有TTS，比较人工前端输入与自动前端输入的听辨差距。</w:t>
+        <w:t>数据与核心标注</w:t>
+      </w:r>
+    </w:p>
+    <w:p>
+      <w:r>
+        <w:t>自然口语仍是目标领域，人工设计后真人录音用于结构控制。自然语料保留上下文以判断字词和结构，但核心模型不读取人工焦点标签或停顿时长。电视剧材料单独记录来源与授权，仅作域外测试候选。</w:t>
+      </w:r>
+    </w:p>
+    <w:p>
+      <w:r>
+        <w:t>每条核心样本保留五类信息：</w:t>
+      </w:r>
+    </w:p>
+    <w:p>
+      <w:r>
+        <w:t>1. 音频与元数据：`utterance_id、speaker_id、source、session、sentence_family、speech_rate、split`。</w:t>
+      </w:r>
+    </w:p>
+    <w:p>
+      <w:r>
+        <w:t>2. 音节与读音：逐音节时间、汉字、IPA、传统调类；未知写UNK。</w:t>
+      </w:r>
+    </w:p>
+    <w:p>
+      <w:r>
+        <w:t>3. 词法与结构：词界、词性、构词、词汇化、局部句法和必要的全句跨度。</w:t>
+      </w:r>
+    </w:p>
+    <w:p>
+      <w:r>
+        <w:t>4. AP边界gold：每个相邻音节位置的0／1标签、候选集合、置信度和裁决记录。</w:t>
+      </w:r>
+    </w:p>
+    <w:p>
+      <w:r>
+        <w:t>5. 质量控制：噪声、错读、F0不可用、明显焦点依赖、不流利停顿等排除原因。</w:t>
+      </w:r>
+    </w:p>
+    <w:p>
+      <w:r>
+        <w:t>Praat只需`syllable、word、AP、misc`四条核心轨道；结构与元数据放对齐JSON。F0曲线可作为标注AP的辅助证据和质检图，不形成AM音高事件标签，也不作为模型的预测目标。暂停建立`tones`和`breaks`核心轨道；已有旧标注只归档，不扩展。</w:t>
+      </w:r>
+    </w:p>
+    <w:p>
+      <w:r>
+        <w:t>双标者先独立听辨和检查域首／域内调形，再结合词典读音、波形和频谱裁决。标注手册必须列出可观察证据，但不能按理论规则预填gold。对无法可靠判断的边界保留`uncertain`并从严格主损失中屏蔽。</w:t>
       </w:r>
     </w:p>
     <w:p>
@@ -235,27 +279,51 @@
         <w:pStyle w:val="1"/>
       </w:pPr>
       <w:r>
-        <w:t>方法四 数据归类与盲测</w:t>
-      </w:r>
-    </w:p>
-    <w:p>
-      <w:r>
-        <w:t>自然会话为主要目标领域；人工设计后真人录音用于因子控制及补覆盖；繁花是表演语体，单独记录演员／角色、集数和场景。三者分开报告，合并训练只作为来源消融实验。机器生成文本和TTS合成音频另记synthetic，不作自然语音gold或最终听辨真值。</w:t>
-      </w:r>
-    </w:p>
-    <w:p>
-      <w:r>
-        <w:t>在转写和标注前，先按会话、说话人与句族确定分组。自然语料60分钟可预留约36分钟训练、12分钟开发、12分钟最终测试，时间是目标而非必须切齐；优先保证分组独立。对话参与者跨会话重复时将相关会话作为连通组放同一侧。说话人不足时明确改为同人未见会话评测，不冒称跨人泛化。</w:t>
-      </w:r>
-    </w:p>
-    <w:p>
-      <w:r>
-        <w:t>受控材料中同字串的所有语境、重复与近似改写属于同一句族，不能跨训练测试。理论实验可在同人同句上比较条件，模型泛化另留未见句族。可将每项6个新族预定4族训练、1族开发、1族最终测试，并明确词族数小、区间可能很宽；与未见说话人评测分别列矩阵，不声称一个简单随机划分同时解决两种泛化。</w:t>
-      </w:r>
-    </w:p>
-    <w:p>
-      <w:r>
-        <w:t>繁花初期保留为域外审阅及测试材料；若后续用于训练，先划独立训练场景，保证演员、相邻情节及重复台词不泄漏到封存测试，并另报是否为未见演员。版权和来源范围按实际使用记录，不把电视剧表演结论外推自然会话。</w:t>
+        <w:t>理论基线</w:t>
+      </w:r>
+    </w:p>
+    <w:p>
+      <w:r>
+        <w:t>本轮只实现能输出低层AP边界的理论部分。</w:t>
+      </w:r>
+    </w:p>
+    <w:p>
+      <w:pPr>
+        <w:pStyle w:val="2"/>
+      </w:pPr>
+      <w:r>
+        <w:t>S&amp;S低层边缘基线</w:t>
+      </w:r>
+    </w:p>
+    <w:p>
+      <w:r>
+        <w:t>按Selkirk与Shen的`Left Lex⁰`思想，在N、V、A等词汇性中心语左边缘提出新域，并为功能成分实现可审计的附着规则。保存每条边界由哪个词性和规则触发。MaP、焦点后删调和高层Top-Down Effect暂不验证。</w:t>
+      </w:r>
+    </w:p>
+    <w:p>
+      <w:pPr>
+        <w:pStyle w:val="2"/>
+      </w:pPr>
+      <w:r>
+        <w:t>端木重音与音步基线</w:t>
+      </w:r>
+    </w:p>
+    <w:p>
+      <w:r>
+        <w:t>根据词内部结构、非中心语突出候选、音节数、词汇化和语速产生低层分域候选。因为本轮不研究焦点，删除词内纠正焦点条件；“老虎头”等例子只作为理论背景，不进入核心实验。重音候选必须来自预先写明的结构规则，不能从gold边界反推。</w:t>
+      </w:r>
+    </w:p>
+    <w:p>
+      <w:pPr>
+        <w:pStyle w:val="2"/>
+      </w:pPr>
+      <w:r>
+        <w:t>Roberts低层表示参考</w:t>
+      </w:r>
+    </w:p>
+    <w:p>
+      <w:r>
+        <w:t>借用Roberts把低层变调单位表示为AP、允许同一句有分组变体和保留不确定性的做法。项目不实现其ip、IP、Break 0至4、焦点类型、句末边界调或完整AM音高事件系统，也不把边界网络称作“Roberts模型”。</w:t>
       </w:r>
     </w:p>
     <w:p>
@@ -263,17 +331,293 @@
         <w:pStyle w:val="1"/>
       </w:pPr>
       <w:r>
-        <w:t>方法五 人工与AI协同</w:t>
-      </w:r>
-    </w:p>
-    <w:p>
-      <w:r>
-        <w:t>将难度相近的不同句族随机分给纯人工与AI预标辅助条件；同一人不在两条件重复看同一句。不同学生交叉承担条件，平衡熟练度。独立质检人员不知处理方式，记录每条合格产出的总人工分钟、返工次数、各层错误率和不确定性。</w:t>
-      </w:r>
-    </w:p>
-    <w:p>
-      <w:r>
-        <w:t>例如人工60分钟完成8条、AI辅助完成14条，但独立质检分别合格8条和7条，则不能说AI更高效。以合格产出和返工后的总时间评价；AI生成建议数不是成果。数字仅示意。</w:t>
+        <w:t>模型与消融</w:t>
+      </w:r>
+    </w:p>
+    <w:p>
+      <w:r>
+        <w:t>保留五种模型可见信息：</w:t>
+      </w:r>
+    </w:p>
+    <w:tbl>
+      <w:tblPr>
+        <w:tblW w:type="auto" w:w="0"/>
+        <w:jc w:val="center"/>
+        <w:tblLook w:firstColumn="1" w:firstRow="1" w:lastColumn="0" w:lastRow="0" w:noHBand="0" w:noVBand="1" w:val="04A0"/>
+      </w:tblPr>
+      <w:tblGrid>
+        <w:gridCol w:w="4153"/>
+        <w:gridCol w:w="4153"/>
+      </w:tblGrid>
+      <w:tr>
+        <w:tc>
+          <w:tcPr>
+            <w:tcW w:type="dxa" w:w="4153"/>
+            <w:vAlign w:val="center"/>
+            <w:tcBorders>
+              <w:top w:val="single" w:sz="4" w:color="D9D9D9"/>
+              <w:left w:val="single" w:sz="4" w:color="D9D9D9"/>
+              <w:bottom w:val="single" w:sz="4" w:color="D9D9D9"/>
+              <w:right w:val="single" w:sz="4" w:color="D9D9D9"/>
+              <w:insideH w:val="single" w:sz="4" w:color="D9D9D9"/>
+              <w:insideV w:val="single" w:sz="4" w:color="D9D9D9"/>
+            </w:tcBorders>
+            <w:shd w:fill="1F4E78"/>
+          </w:tcPr>
+          <w:p>
+            <w:r>
+              <w:rPr>
+                <w:b/>
+                <w:color w:val="FFFFFF"/>
+              </w:rPr>
+              <w:t>等级</w:t>
+            </w:r>
+          </w:p>
+        </w:tc>
+        <w:tc>
+          <w:tcPr>
+            <w:tcW w:type="dxa" w:w="4153"/>
+            <w:vAlign w:val="center"/>
+            <w:tcBorders>
+              <w:top w:val="single" w:sz="4" w:color="D9D9D9"/>
+              <w:left w:val="single" w:sz="4" w:color="D9D9D9"/>
+              <w:bottom w:val="single" w:sz="4" w:color="D9D9D9"/>
+              <w:right w:val="single" w:sz="4" w:color="D9D9D9"/>
+              <w:insideH w:val="single" w:sz="4" w:color="D9D9D9"/>
+              <w:insideV w:val="single" w:sz="4" w:color="D9D9D9"/>
+            </w:tcBorders>
+            <w:shd w:fill="1F4E78"/>
+          </w:tcPr>
+          <w:p>
+            <w:r>
+              <w:rPr>
+                <w:b/>
+                <w:color w:val="FFFFFF"/>
+              </w:rPr>
+              <w:t>输入</w:t>
+            </w:r>
+          </w:p>
+        </w:tc>
+      </w:tr>
+      <w:tr>
+        <w:tc>
+          <w:tcPr>
+            <w:tcW w:type="dxa" w:w="4153"/>
+            <w:vAlign w:val="center"/>
+            <w:tcBorders>
+              <w:top w:val="single" w:sz="4" w:color="D9D9D9"/>
+              <w:left w:val="single" w:sz="4" w:color="D9D9D9"/>
+              <w:bottom w:val="single" w:sz="4" w:color="D9D9D9"/>
+              <w:right w:val="single" w:sz="4" w:color="D9D9D9"/>
+              <w:insideH w:val="single" w:sz="4" w:color="D9D9D9"/>
+              <w:insideV w:val="single" w:sz="4" w:color="D9D9D9"/>
+            </w:tcBorders>
+          </w:tcPr>
+          <w:p>
+            <w:r>
+              <w:t>L0</w:t>
+            </w:r>
+          </w:p>
+        </w:tc>
+        <w:tc>
+          <w:tcPr>
+            <w:tcW w:type="dxa" w:w="4153"/>
+            <w:vAlign w:val="center"/>
+            <w:tcBorders>
+              <w:top w:val="single" w:sz="4" w:color="D9D9D9"/>
+              <w:left w:val="single" w:sz="4" w:color="D9D9D9"/>
+              <w:bottom w:val="single" w:sz="4" w:color="D9D9D9"/>
+              <w:right w:val="single" w:sz="4" w:color="D9D9D9"/>
+              <w:insideH w:val="single" w:sz="4" w:color="D9D9D9"/>
+              <w:insideV w:val="single" w:sz="4" w:color="D9D9D9"/>
+            </w:tcBorders>
+          </w:tcPr>
+          <w:p>
+            <w:r>
+              <w:t>汉字或音节序列</w:t>
+            </w:r>
+          </w:p>
+        </w:tc>
+      </w:tr>
+      <w:tr>
+        <w:tc>
+          <w:tcPr>
+            <w:tcW w:type="dxa" w:w="4153"/>
+            <w:vAlign w:val="center"/>
+            <w:tcBorders>
+              <w:top w:val="single" w:sz="4" w:color="D9D9D9"/>
+              <w:left w:val="single" w:sz="4" w:color="D9D9D9"/>
+              <w:bottom w:val="single" w:sz="4" w:color="D9D9D9"/>
+              <w:right w:val="single" w:sz="4" w:color="D9D9D9"/>
+              <w:insideH w:val="single" w:sz="4" w:color="D9D9D9"/>
+              <w:insideV w:val="single" w:sz="4" w:color="D9D9D9"/>
+            </w:tcBorders>
+            <w:shd w:fill="EAF2F8"/>
+          </w:tcPr>
+          <w:p>
+            <w:r>
+              <w:t>L1</w:t>
+            </w:r>
+          </w:p>
+        </w:tc>
+        <w:tc>
+          <w:tcPr>
+            <w:tcW w:type="dxa" w:w="4153"/>
+            <w:vAlign w:val="center"/>
+            <w:tcBorders>
+              <w:top w:val="single" w:sz="4" w:color="D9D9D9"/>
+              <w:left w:val="single" w:sz="4" w:color="D9D9D9"/>
+              <w:bottom w:val="single" w:sz="4" w:color="D9D9D9"/>
+              <w:right w:val="single" w:sz="4" w:color="D9D9D9"/>
+              <w:insideH w:val="single" w:sz="4" w:color="D9D9D9"/>
+              <w:insideV w:val="single" w:sz="4" w:color="D9D9D9"/>
+            </w:tcBorders>
+            <w:shd w:fill="EAF2F8"/>
+          </w:tcPr>
+          <w:p>
+            <w:r>
+              <w:t>L0加词典读音与词界</w:t>
+            </w:r>
+          </w:p>
+        </w:tc>
+      </w:tr>
+      <w:tr>
+        <w:tc>
+          <w:tcPr>
+            <w:tcW w:type="dxa" w:w="4153"/>
+            <w:vAlign w:val="center"/>
+            <w:tcBorders>
+              <w:top w:val="single" w:sz="4" w:color="D9D9D9"/>
+              <w:left w:val="single" w:sz="4" w:color="D9D9D9"/>
+              <w:bottom w:val="single" w:sz="4" w:color="D9D9D9"/>
+              <w:right w:val="single" w:sz="4" w:color="D9D9D9"/>
+              <w:insideH w:val="single" w:sz="4" w:color="D9D9D9"/>
+              <w:insideV w:val="single" w:sz="4" w:color="D9D9D9"/>
+            </w:tcBorders>
+          </w:tcPr>
+          <w:p>
+            <w:r>
+              <w:t>L2</w:t>
+            </w:r>
+          </w:p>
+        </w:tc>
+        <w:tc>
+          <w:tcPr>
+            <w:tcW w:type="dxa" w:w="4153"/>
+            <w:vAlign w:val="center"/>
+            <w:tcBorders>
+              <w:top w:val="single" w:sz="4" w:color="D9D9D9"/>
+              <w:left w:val="single" w:sz="4" w:color="D9D9D9"/>
+              <w:bottom w:val="single" w:sz="4" w:color="D9D9D9"/>
+              <w:right w:val="single" w:sz="4" w:color="D9D9D9"/>
+              <w:insideH w:val="single" w:sz="4" w:color="D9D9D9"/>
+              <w:insideV w:val="single" w:sz="4" w:color="D9D9D9"/>
+            </w:tcBorders>
+          </w:tcPr>
+          <w:p>
+            <w:r>
+              <w:t>L1加词性、虚实词、构词和词汇化</w:t>
+            </w:r>
+          </w:p>
+        </w:tc>
+      </w:tr>
+      <w:tr>
+        <w:tc>
+          <w:tcPr>
+            <w:tcW w:type="dxa" w:w="4153"/>
+            <w:vAlign w:val="center"/>
+            <w:tcBorders>
+              <w:top w:val="single" w:sz="4" w:color="D9D9D9"/>
+              <w:left w:val="single" w:sz="4" w:color="D9D9D9"/>
+              <w:bottom w:val="single" w:sz="4" w:color="D9D9D9"/>
+              <w:right w:val="single" w:sz="4" w:color="D9D9D9"/>
+              <w:insideH w:val="single" w:sz="4" w:color="D9D9D9"/>
+              <w:insideV w:val="single" w:sz="4" w:color="D9D9D9"/>
+            </w:tcBorders>
+            <w:shd w:fill="EAF2F8"/>
+          </w:tcPr>
+          <w:p>
+            <w:r>
+              <w:t>L3</w:t>
+            </w:r>
+          </w:p>
+        </w:tc>
+        <w:tc>
+          <w:tcPr>
+            <w:tcW w:type="dxa" w:w="4153"/>
+            <w:vAlign w:val="center"/>
+            <w:tcBorders>
+              <w:top w:val="single" w:sz="4" w:color="D9D9D9"/>
+              <w:left w:val="single" w:sz="4" w:color="D9D9D9"/>
+              <w:bottom w:val="single" w:sz="4" w:color="D9D9D9"/>
+              <w:right w:val="single" w:sz="4" w:color="D9D9D9"/>
+              <w:insideH w:val="single" w:sz="4" w:color="D9D9D9"/>
+              <w:insideV w:val="single" w:sz="4" w:color="D9D9D9"/>
+            </w:tcBorders>
+            <w:shd w:fill="EAF2F8"/>
+          </w:tcPr>
+          <w:p>
+            <w:r>
+              <w:t>L2加局部句法与构式</w:t>
+            </w:r>
+          </w:p>
+        </w:tc>
+      </w:tr>
+      <w:tr>
+        <w:tc>
+          <w:tcPr>
+            <w:tcW w:type="dxa" w:w="4153"/>
+            <w:vAlign w:val="center"/>
+            <w:tcBorders>
+              <w:top w:val="single" w:sz="4" w:color="D9D9D9"/>
+              <w:left w:val="single" w:sz="4" w:color="D9D9D9"/>
+              <w:bottom w:val="single" w:sz="4" w:color="D9D9D9"/>
+              <w:right w:val="single" w:sz="4" w:color="D9D9D9"/>
+              <w:insideH w:val="single" w:sz="4" w:color="D9D9D9"/>
+              <w:insideV w:val="single" w:sz="4" w:color="D9D9D9"/>
+            </w:tcBorders>
+          </w:tcPr>
+          <w:p>
+            <w:r>
+              <w:t>L4</w:t>
+            </w:r>
+          </w:p>
+        </w:tc>
+        <w:tc>
+          <w:tcPr>
+            <w:tcW w:type="dxa" w:w="4153"/>
+            <w:vAlign w:val="center"/>
+            <w:tcBorders>
+              <w:top w:val="single" w:sz="4" w:color="D9D9D9"/>
+              <w:left w:val="single" w:sz="4" w:color="D9D9D9"/>
+              <w:bottom w:val="single" w:sz="4" w:color="D9D9D9"/>
+              <w:right w:val="single" w:sz="4" w:color="D9D9D9"/>
+              <w:insideH w:val="single" w:sz="4" w:color="D9D9D9"/>
+              <w:insideV w:val="single" w:sz="4" w:color="D9D9D9"/>
+            </w:tcBorders>
+          </w:tcPr>
+          <w:p>
+            <w:r>
+              <w:t>L3加全句跨度和嵌入结构</w:t>
+            </w:r>
+          </w:p>
+        </w:tc>
+      </w:tr>
+    </w:tbl>
+    <w:p/>
+    <w:p>
+      <w:r>
+        <w:t>主模型采用字符／音节BiLSTM或小型Transformer，对每个相邻位置输出AP边界概率。起始配置可沿用128维嵌入、一层双向LSTM、0.2 dropout、Adam学习率0.001、batch16和早停；固定多个随机种子。另比较规则基线、CRF或线性分类器，避免低资源情况下只报告复杂模型。</w:t>
+      </w:r>
+    </w:p>
+    <w:p>
+      <w:r>
+        <w:t>人工结构与自动结构分别测试。自动parser使用折外预测或冻结版本，不能读取最终测试标签。模型不输入焦点类别、真实停顿、目标音频F0或实际音节时长；若使用计划语速，必须在合成前可知并与目标录音测得的真实语速分开。</w:t>
+      </w:r>
+    </w:p>
+    <w:p>
+      <w:r>
+        <w:t>输出必须经过合法性检查：句末视为AP结束，不允许空域或交叉层级；Top-k候选去重并限制数量。若一句有多个可靠参考分域，训练和评价明确采用集合标签、软标签或多参考匹配中的哪一种。</w:t>
       </w:r>
     </w:p>
     <w:p>
@@ -281,22 +625,65 @@
         <w:pStyle w:val="1"/>
       </w:pPr>
       <w:r>
-        <w:t>近期任务与成果</w:t>
-      </w:r>
-    </w:p>
-    <w:p>
-      <w:r>
-        <w:t>第1至2周完成文献综述、母语者招募确认、自然会话收集安排和材料审阅，学习图31、32、30、38及九层示例。第3至4周完成96条小试与双标，冻结v1标签和数据分组。第5至8周争取完成60分钟自然语料与核心受控录音，计算机组搭建可重跑提取和模型基线。第9至12周做消融、受控理论分析、独立听辨、人机时间实验和报告。</w:t>
-      </w:r>
-    </w:p>
-    <w:p>
-      <w:r>
-        <w:t>预计交付：有来源的自然语料与受控材料、分层标注规范、可审计规则及网络基线、构式信息贡献表、三套理论的支持／限制证据、TTS前端示例。未达到稳定标注时先缩小模型目标，不把不可靠标签大量导入训练。</w:t>
-      </w:r>
-    </w:p>
-    <w:p>
-      <w:r>
-        <w:t>核心文献：Selkirk与Shen 1990，Prosodic domains in Shanghai Chinese，pp.313至337；Duanmu 2005稿，The Tone-Syntax Interface in Chinese，§4.2；Roberts 2020，An Autosegmental Metrical Model of Shanghainese Tone and Intonation，§4.1至4.7、第5章及§6.3至6.4。延伸方法参考Sun与Chen 2015、Selkirk 2009公开稿／2011章、Xu与Prom-on 2014。</w:t>
+        <w:t>数据划分与评价</w:t>
+      </w:r>
+    </w:p>
+    <w:p>
+      <w:r>
+        <w:t>自然口语目标仍为至少60分钟有效材料，按说话人和会话关系优先隔离，再尽量接近36／12／12分钟训练、开发、最终测试。人工材料按完整句族隔离；同一字串的速度条件、重复和近似改写不能跨集合。小试材料全部进入开发集。</w:t>
+      </w:r>
+    </w:p>
+    <w:p>
+      <w:r>
+        <w:t>主要指标为音节间AP边界Precision、Recall和F1，以及整句完全匹配率。补充报告Top-k候选覆盖、不合理候选率、每句边界数偏差、按构式／说话人／句长分层的区间。模型阈值只在开发集选择，最终测试只运行冻结版本。</w:t>
+      </w:r>
+    </w:p>
+    <w:p>
+      <w:r>
+        <w:t>边界F1只判断位置，不设置毫秒容差；标签单位已经是离散音节间隙。若音节转写本身错误，先修B层，不把对齐误差算成边界容差。统计时以说话人和句族为抽样层级，不能把同一句重复或每条F0采样点当成独立样本。</w:t>
+      </w:r>
+    </w:p>
+    <w:p>
+      <w:r>
+        <w:t>神经消融只说明某类结构信息对预测有无增量，不单独证明音系机制。理论规则的评价同时报告覆盖：只在少量位置作出预测的高精确率规则，不能与覆盖全部位置的模型直接只比一个F1。</w:t>
+      </w:r>
+    </w:p>
+    <w:p>
+      <w:pPr>
+        <w:pStyle w:val="1"/>
+      </w:pPr>
+      <w:r>
+        <w:t>三个月执行与交付</w:t>
+      </w:r>
+    </w:p>
+    <w:p>
+      <w:r>
+        <w:t>第1至2周：冻结二分类边界schema，审阅C01至C08材料，确认可招募人数和自然录音量；两名学生完成20至30条试标，修订边界证据说明。</w:t>
+      </w:r>
+    </w:p>
+    <w:p>
+      <w:r>
+        <w:t>第3至4周：完成约96条中性语境小试和双标，计算AP边界一致性、每条耗时与不确定比例；冻结词典、句族和开发集。</w:t>
+      </w:r>
+    </w:p>
+    <w:p>
+      <w:r>
+        <w:t>第5至8周：采集自然口语并完成核心结构受控录音；建立L0至L4输入、理论规则基线和小型神经基线；每周审计错读、结构歧义、焦点依赖与不流利排除项。</w:t>
+      </w:r>
+    </w:p>
+    <w:p>
+      <w:r>
+        <w:t>第9至12周：在未见句族、说话人和来源上完成消融、规则迁移、Top-k和错误分析；进行固定预算的人机标注效率实验；用少量样例确认预测边界可被现有TTS前端消费，但不评价焦点、停顿或完整句调。</w:t>
+      </w:r>
+    </w:p>
+    <w:p>
+      <w:r>
+        <w:t>正式交付包括：低层变调界限定义、材料与匿名元数据、裁决后AP边界、结构特征、可审计规则、模型基线、冻结划分、错误分析和TTS接口示例。若AP标注一致性不足，优先缩小语料和构式范围，不增加高层韵律标签掩盖问题。</w:t>
+      </w:r>
+    </w:p>
+    <w:p>
+      <w:r>
+        <w:t>核心文献仍包括Selkirk与Shen 1990、Duanmu 2005和Roberts 2020，但只读取与低层变调域、词法句法映射、音步和AP识别直接相关的部分。焦点、ip/IP和句末语调文献保留在归档笔记，待后续课题启用。</w:t>
       </w:r>
     </w:p>
     <w:sectPr>

</xml_diff>